<commit_message>
Todo terminado solo faltan test y dockerizar v2
</commit_message>
<xml_diff>
--- a/GUIA.docx
+++ b/GUIA.docx
@@ -180,35 +180,26 @@
         <w:rPr>
           <w:lang w:val="es-MX"/>
         </w:rPr>
-        <w:t>, y ya hay ciertos métodos que solo le permiten manipular sus propios Posts</w:t>
-      </w:r>
-    </w:p>
-    <w:p>
-      <w:pPr>
-        <w:rPr>
-          <w:lang w:val="es-MX"/>
-        </w:rPr>
-      </w:pPr>
-    </w:p>
-    <w:p>
-      <w:pPr>
-        <w:rPr>
-          <w:lang w:val="es-MX"/>
-        </w:rPr>
-      </w:pPr>
-      <w:r>
-        <w:rPr>
-          <w:lang w:val="es-MX"/>
-        </w:rPr>
-        <w:t>Hoy:</w:t>
-      </w:r>
-    </w:p>
-    <w:p>
-      <w:pPr>
-        <w:rPr>
-          <w:lang w:val="es-MX"/>
-        </w:rPr>
-      </w:pPr>
+        <w:t xml:space="preserve">, y ya hay ciertos métodos </w:t>
+      </w:r>
+      <w:r>
+        <w:rPr>
+          <w:lang w:val="es-MX"/>
+        </w:rPr>
+        <w:t xml:space="preserve">y endpoints </w:t>
+      </w:r>
+      <w:r>
+        <w:rPr>
+          <w:lang w:val="es-MX"/>
+        </w:rPr>
+        <w:t>que solo le permiten manipular sus propios Posts</w:t>
+      </w:r>
+      <w:r>
+        <w:rPr>
+          <w:lang w:val="es-MX"/>
+        </w:rPr>
+        <w:t xml:space="preserve"> y no los ajenos.</w:t>
+      </w:r>
     </w:p>
     <w:p>
       <w:pPr>
@@ -225,7 +216,20 @@
         <w:rPr>
           <w:lang w:val="es-MX"/>
         </w:rPr>
-        <w:t>En métodos que me traen los post del usuario al cuál pertenece el Token, debo hacer que se restrinja la información, que no se traiga toda la información del propietario del post, solo el nombre</w:t>
+        <w:t>Creo que ya terminamos toda  la lógica de servicio</w:t>
+      </w:r>
+    </w:p>
+    <w:p>
+      <w:pPr>
+        <w:rPr>
+          <w:lang w:val="es-MX"/>
+        </w:rPr>
+      </w:pPr>
+      <w:r>
+        <w:rPr>
+          <w:lang w:val="es-MX"/>
+        </w:rPr>
+        <w:t>Hoy:</w:t>
       </w:r>
     </w:p>
     <w:p>
@@ -243,7 +247,7 @@
         <w:rPr>
           <w:lang w:val="es-MX"/>
         </w:rPr>
-        <w:t>Revisa OAuth2LogginSuccess, y la clase securityConfig para entender los nuevos agregados en estas clases</w:t>
+        <w:t>Revisar si en verdad ya terminamos toda la lógica de servicio y pasar a los test.</w:t>
       </w:r>
     </w:p>
     <w:p>
@@ -261,37 +265,7 @@
         <w:rPr>
           <w:lang w:val="es-MX"/>
         </w:rPr>
-        <w:t xml:space="preserve">De que manera quiero guardar los usuarios, como les asociaré su usersec, su correo, como haré para que al iniar sesión con OAuth se verifique el correo para ver si el usuario ya existe </w:t>
-      </w:r>
-      <w:r>
-        <w:rPr>
-          <w:lang w:val="es-MX"/>
-        </w:rPr>
-        <w:t xml:space="preserve">y tiene UserSec asociado </w:t>
-      </w:r>
-      <w:r>
-        <w:rPr>
-          <w:lang w:val="es-MX"/>
-        </w:rPr>
-        <w:t>y tiene roles y permisos</w:t>
-      </w:r>
-      <w:r>
-        <w:rPr>
-          <w:lang w:val="es-MX"/>
-        </w:rPr>
-        <w:t xml:space="preserve"> y así darle acceso con JWT</w:t>
-      </w:r>
-      <w:r>
-        <w:rPr>
-          <w:lang w:val="es-MX"/>
-        </w:rPr>
-        <w:t xml:space="preserve">, y sino crearlo en la base de </w:t>
-      </w:r>
-      <w:r>
-        <w:rPr>
-          <w:lang w:val="es-MX"/>
-        </w:rPr>
-        <w:t>datos como usuario normal y darle acceso al programa.</w:t>
+        <w:t>En métodos que me traen los post del usuario al cuál pertenece el Token, debo hacer que se restrinja la información, que no se traiga toda la información del propietario del post, solo el nombre</w:t>
       </w:r>
     </w:p>
     <w:p>
@@ -309,42 +283,8 @@
         <w:rPr>
           <w:lang w:val="es-MX"/>
         </w:rPr>
-        <w:t>Hacer que no se pueda obtener acceso al endpoint de generación de Tokens, por seguridad</w:t>
-      </w:r>
-    </w:p>
-    <w:p>
-      <w:pPr>
-        <w:rPr>
-          <w:lang w:val="es-MX"/>
-        </w:rPr>
-      </w:pPr>
-      <w:r>
-        <w:rPr>
-          <w:lang w:val="es-MX"/>
-        </w:rPr>
-        <w:t xml:space="preserve">       . OAuh2 será la única manera de crear nuevos usuarios y a la vez autenticarse.</w:t>
-      </w:r>
-    </w:p>
-    <w:p>
-      <w:pPr>
-        <w:rPr>
-          <w:lang w:val="es-MX"/>
-        </w:rPr>
-      </w:pPr>
-    </w:p>
-    <w:p>
-      <w:pPr>
-        <w:rPr>
-          <w:lang w:val="es-MX"/>
-        </w:rPr>
-      </w:pPr>
-    </w:p>
-    <w:p>
-      <w:pPr>
-        <w:rPr>
-          <w:lang w:val="es-MX"/>
-        </w:rPr>
-      </w:pPr>
+        <w:t>Revisa OAuth2LogginSuccess, y la clase securityConfig para entender los nuevos agregados en estas clases</w:t>
+      </w:r>
     </w:p>
     <w:p>
       <w:pPr>
@@ -361,8 +301,37 @@
         <w:rPr>
           <w:lang w:val="es-MX"/>
         </w:rPr>
-        <w:lastRenderedPageBreak/>
-        <w:t>Hacer que cada usuario solo pueda postear cosas que queden asociadas a su id y por lo tanto solo pueda modificar sus propios posteos.</w:t>
+        <w:t xml:space="preserve">De que manera quiero guardar los usuarios, como les asociaré su usersec, su correo, como haré para que al iniar sesión con OAuth se verifique el correo para ver si el usuario ya existe </w:t>
+      </w:r>
+      <w:r>
+        <w:rPr>
+          <w:lang w:val="es-MX"/>
+        </w:rPr>
+        <w:t xml:space="preserve">y tiene UserSec asociado </w:t>
+      </w:r>
+      <w:r>
+        <w:rPr>
+          <w:lang w:val="es-MX"/>
+        </w:rPr>
+        <w:t>y tiene roles y permisos</w:t>
+      </w:r>
+      <w:r>
+        <w:rPr>
+          <w:lang w:val="es-MX"/>
+        </w:rPr>
+        <w:t xml:space="preserve"> y así darle acceso con JWT</w:t>
+      </w:r>
+      <w:r>
+        <w:rPr>
+          <w:lang w:val="es-MX"/>
+        </w:rPr>
+        <w:t xml:space="preserve">, y sino crearlo en la base de </w:t>
+      </w:r>
+      <w:r>
+        <w:rPr>
+          <w:lang w:val="es-MX"/>
+        </w:rPr>
+        <w:t>datos como usuario normal y darle acceso al programa.</w:t>
       </w:r>
     </w:p>
     <w:p>
@@ -380,6 +349,77 @@
         <w:rPr>
           <w:lang w:val="es-MX"/>
         </w:rPr>
+        <w:t>Hacer que no se pueda obtener acceso al endpoint de generación de Tokens, por seguridad</w:t>
+      </w:r>
+    </w:p>
+    <w:p>
+      <w:pPr>
+        <w:rPr>
+          <w:lang w:val="es-MX"/>
+        </w:rPr>
+      </w:pPr>
+      <w:r>
+        <w:rPr>
+          <w:lang w:val="es-MX"/>
+        </w:rPr>
+        <w:t xml:space="preserve">       . OAuh2 será la única manera de crear nuevos usuarios y a la vez autenticarse.</w:t>
+      </w:r>
+    </w:p>
+    <w:p>
+      <w:pPr>
+        <w:rPr>
+          <w:lang w:val="es-MX"/>
+        </w:rPr>
+      </w:pPr>
+    </w:p>
+    <w:p>
+      <w:pPr>
+        <w:rPr>
+          <w:lang w:val="es-MX"/>
+        </w:rPr>
+      </w:pPr>
+    </w:p>
+    <w:p>
+      <w:pPr>
+        <w:rPr>
+          <w:lang w:val="es-MX"/>
+        </w:rPr>
+      </w:pPr>
+    </w:p>
+    <w:p>
+      <w:pPr>
+        <w:pStyle w:val="Prrafodelista"/>
+        <w:numPr>
+          <w:ilvl w:val="0"/>
+          <w:numId w:val="4"/>
+        </w:numPr>
+        <w:rPr>
+          <w:lang w:val="es-MX"/>
+        </w:rPr>
+      </w:pPr>
+      <w:r>
+        <w:rPr>
+          <w:lang w:val="es-MX"/>
+        </w:rPr>
+        <w:t>Hacer que cada usuario solo pueda postear cosas que queden asociadas a su id y por lo tanto solo pueda modificar sus propios posteos.</w:t>
+      </w:r>
+    </w:p>
+    <w:p>
+      <w:pPr>
+        <w:pStyle w:val="Prrafodelista"/>
+        <w:numPr>
+          <w:ilvl w:val="0"/>
+          <w:numId w:val="4"/>
+        </w:numPr>
+        <w:rPr>
+          <w:lang w:val="es-MX"/>
+        </w:rPr>
+      </w:pPr>
+      <w:r>
+        <w:rPr>
+          <w:lang w:val="es-MX"/>
+        </w:rPr>
+        <w:lastRenderedPageBreak/>
         <w:t xml:space="preserve">Hacer que </w:t>
       </w:r>
       <w:r>

</xml_diff>

<commit_message>
terminado, solo faltan test con docker, credenciales guardadas en variables de entorno
</commit_message>
<xml_diff>
--- a/GUIA.docx
+++ b/GUIA.docx
@@ -38,7 +38,43 @@
           <w:bCs/>
           <w:lang w:val="es-MX"/>
         </w:rPr>
-        <w:t>Ya está el crud de usuarios, roles y permisos y la auth configurada con ellos.</w:t>
+        <w:t xml:space="preserve">Ya está el </w:t>
+      </w:r>
+      <w:proofErr w:type="spellStart"/>
+      <w:r>
+        <w:rPr>
+          <w:b/>
+          <w:bCs/>
+          <w:lang w:val="es-MX"/>
+        </w:rPr>
+        <w:t>crud</w:t>
+      </w:r>
+      <w:proofErr w:type="spellEnd"/>
+      <w:r>
+        <w:rPr>
+          <w:b/>
+          <w:bCs/>
+          <w:lang w:val="es-MX"/>
+        </w:rPr>
+        <w:t xml:space="preserve"> de usuarios, roles y permisos y la </w:t>
+      </w:r>
+      <w:proofErr w:type="spellStart"/>
+      <w:r>
+        <w:rPr>
+          <w:b/>
+          <w:bCs/>
+          <w:lang w:val="es-MX"/>
+        </w:rPr>
+        <w:t>auth</w:t>
+      </w:r>
+      <w:proofErr w:type="spellEnd"/>
+      <w:r>
+        <w:rPr>
+          <w:b/>
+          <w:bCs/>
+          <w:lang w:val="es-MX"/>
+        </w:rPr>
+        <w:t xml:space="preserve"> configurada con ellos.</w:t>
       </w:r>
     </w:p>
     <w:p>
@@ -54,37 +90,95 @@
           <w:lang w:val="es-MX"/>
         </w:rPr>
       </w:pPr>
-      <w:r>
-        <w:rPr>
-          <w:b/>
-          <w:bCs/>
-          <w:lang w:val="es-MX"/>
-        </w:rPr>
-        <w:t xml:space="preserve">Auth mediandte </w:t>
-      </w:r>
-      <w:r>
-        <w:rPr>
-          <w:b/>
-          <w:bCs/>
-          <w:lang w:val="es-MX"/>
-        </w:rPr>
-        <w:t xml:space="preserve">form </w:t>
-      </w:r>
-      <w:r>
-        <w:rPr>
-          <w:b/>
-          <w:bCs/>
-          <w:lang w:val="es-MX"/>
-        </w:rPr>
-        <w:t xml:space="preserve">login, </w:t>
-      </w:r>
-      <w:r>
-        <w:rPr>
-          <w:b/>
-          <w:bCs/>
-          <w:lang w:val="es-MX"/>
-        </w:rPr>
-        <w:t>Jwt y OAuth2 configurados.</w:t>
+      <w:proofErr w:type="spellStart"/>
+      <w:r>
+        <w:rPr>
+          <w:b/>
+          <w:bCs/>
+          <w:lang w:val="es-MX"/>
+        </w:rPr>
+        <w:t>Auth</w:t>
+      </w:r>
+      <w:proofErr w:type="spellEnd"/>
+      <w:r>
+        <w:rPr>
+          <w:b/>
+          <w:bCs/>
+          <w:lang w:val="es-MX"/>
+        </w:rPr>
+        <w:t xml:space="preserve"> </w:t>
+      </w:r>
+      <w:proofErr w:type="spellStart"/>
+      <w:r>
+        <w:rPr>
+          <w:b/>
+          <w:bCs/>
+          <w:lang w:val="es-MX"/>
+        </w:rPr>
+        <w:t>mediandte</w:t>
+      </w:r>
+      <w:proofErr w:type="spellEnd"/>
+      <w:r>
+        <w:rPr>
+          <w:b/>
+          <w:bCs/>
+          <w:lang w:val="es-MX"/>
+        </w:rPr>
+        <w:t xml:space="preserve"> </w:t>
+      </w:r>
+      <w:proofErr w:type="spellStart"/>
+      <w:r>
+        <w:rPr>
+          <w:b/>
+          <w:bCs/>
+          <w:lang w:val="es-MX"/>
+        </w:rPr>
+        <w:t>form</w:t>
+      </w:r>
+      <w:proofErr w:type="spellEnd"/>
+      <w:r>
+        <w:rPr>
+          <w:b/>
+          <w:bCs/>
+          <w:lang w:val="es-MX"/>
+        </w:rPr>
+        <w:t xml:space="preserve"> </w:t>
+      </w:r>
+      <w:proofErr w:type="spellStart"/>
+      <w:r>
+        <w:rPr>
+          <w:b/>
+          <w:bCs/>
+          <w:lang w:val="es-MX"/>
+        </w:rPr>
+        <w:t>login</w:t>
+      </w:r>
+      <w:proofErr w:type="spellEnd"/>
+      <w:r>
+        <w:rPr>
+          <w:b/>
+          <w:bCs/>
+          <w:lang w:val="es-MX"/>
+        </w:rPr>
+        <w:t xml:space="preserve">, </w:t>
+      </w:r>
+      <w:proofErr w:type="spellStart"/>
+      <w:r>
+        <w:rPr>
+          <w:b/>
+          <w:bCs/>
+          <w:lang w:val="es-MX"/>
+        </w:rPr>
+        <w:t>Jwt</w:t>
+      </w:r>
+      <w:proofErr w:type="spellEnd"/>
+      <w:r>
+        <w:rPr>
+          <w:b/>
+          <w:bCs/>
+          <w:lang w:val="es-MX"/>
+        </w:rPr>
+        <w:t xml:space="preserve"> y OAuth2 configurados.</w:t>
       </w:r>
     </w:p>
     <w:p>
@@ -114,8 +208,18 @@
           <w:bCs/>
           <w:lang w:val="es-MX"/>
         </w:rPr>
-        <w:t>Al arrancar la app se inicia en la base de datos un usuario con role Admin</w:t>
-      </w:r>
+        <w:t xml:space="preserve">Al arrancar la app se inicia en la base de datos un usuario con role </w:t>
+      </w:r>
+      <w:proofErr w:type="spellStart"/>
+      <w:r>
+        <w:rPr>
+          <w:b/>
+          <w:bCs/>
+          <w:lang w:val="es-MX"/>
+        </w:rPr>
+        <w:t>Admin</w:t>
+      </w:r>
+      <w:proofErr w:type="spellEnd"/>
     </w:p>
     <w:p>
       <w:pPr>
@@ -136,7 +240,97 @@
           <w:bCs/>
           <w:lang w:val="es-MX"/>
         </w:rPr>
-        <w:t>Ya están securizados los endpoints de roles, usersec y permission, solo admins pueden acceder</w:t>
+        <w:t xml:space="preserve">Ya están </w:t>
+      </w:r>
+      <w:proofErr w:type="spellStart"/>
+      <w:r>
+        <w:rPr>
+          <w:b/>
+          <w:bCs/>
+          <w:lang w:val="es-MX"/>
+        </w:rPr>
+        <w:t>securizados</w:t>
+      </w:r>
+      <w:proofErr w:type="spellEnd"/>
+      <w:r>
+        <w:rPr>
+          <w:b/>
+          <w:bCs/>
+          <w:lang w:val="es-MX"/>
+        </w:rPr>
+        <w:t xml:space="preserve"> los </w:t>
+      </w:r>
+      <w:proofErr w:type="spellStart"/>
+      <w:r>
+        <w:rPr>
+          <w:b/>
+          <w:bCs/>
+          <w:lang w:val="es-MX"/>
+        </w:rPr>
+        <w:t>endpoints</w:t>
+      </w:r>
+      <w:proofErr w:type="spellEnd"/>
+      <w:r>
+        <w:rPr>
+          <w:b/>
+          <w:bCs/>
+          <w:lang w:val="es-MX"/>
+        </w:rPr>
+        <w:t xml:space="preserve"> de roles, </w:t>
+      </w:r>
+      <w:proofErr w:type="spellStart"/>
+      <w:r>
+        <w:rPr>
+          <w:b/>
+          <w:bCs/>
+          <w:lang w:val="es-MX"/>
+        </w:rPr>
+        <w:t>usersec</w:t>
+      </w:r>
+      <w:proofErr w:type="spellEnd"/>
+      <w:r>
+        <w:rPr>
+          <w:b/>
+          <w:bCs/>
+          <w:lang w:val="es-MX"/>
+        </w:rPr>
+        <w:t xml:space="preserve"> y </w:t>
+      </w:r>
+      <w:proofErr w:type="spellStart"/>
+      <w:r>
+        <w:rPr>
+          <w:b/>
+          <w:bCs/>
+          <w:lang w:val="es-MX"/>
+        </w:rPr>
+        <w:t>permission</w:t>
+      </w:r>
+      <w:proofErr w:type="spellEnd"/>
+      <w:r>
+        <w:rPr>
+          <w:b/>
+          <w:bCs/>
+          <w:lang w:val="es-MX"/>
+        </w:rPr>
+        <w:t xml:space="preserve">, solo </w:t>
+      </w:r>
+      <w:proofErr w:type="spellStart"/>
+      <w:r>
+        <w:rPr>
+          <w:b/>
+          <w:bCs/>
+          <w:lang w:val="es-MX"/>
+        </w:rPr>
+        <w:t>admins</w:t>
+      </w:r>
+      <w:proofErr w:type="spellEnd"/>
+      <w:r>
+        <w:rPr>
+          <w:b/>
+          <w:bCs/>
+          <w:lang w:val="es-MX"/>
+        </w:rPr>
+        <w:t xml:space="preserve"> pueden acceder</w:t>
       </w:r>
     </w:p>
     <w:p>
@@ -154,7 +348,49 @@
         <w:rPr>
           <w:lang w:val="es-MX"/>
         </w:rPr>
-        <w:t>Se usará OAuth para ingresar al sistema, una vez dentro se debe verificar mediante el correo si es que ya hay un usuario registrado con este mismo, si si se libera un token con sus roles y permisos , si no existe pues se procederá a crear el usuario con role normal de usuario, y  se le asociará su usersec con esos roles y permisos.</w:t>
+        <w:t xml:space="preserve">Se usará OAuth para ingresar al sistema, una vez dentro se debe verificar mediante el correo si es que ya hay un usuario registrado con este mismo, si </w:t>
+      </w:r>
+      <w:proofErr w:type="spellStart"/>
+      <w:r>
+        <w:rPr>
+          <w:lang w:val="es-MX"/>
+        </w:rPr>
+        <w:t>si</w:t>
+      </w:r>
+      <w:proofErr w:type="spellEnd"/>
+      <w:r>
+        <w:rPr>
+          <w:lang w:val="es-MX"/>
+        </w:rPr>
+        <w:t xml:space="preserve"> se libera un token con sus roles y </w:t>
+      </w:r>
+      <w:proofErr w:type="gramStart"/>
+      <w:r>
+        <w:rPr>
+          <w:lang w:val="es-MX"/>
+        </w:rPr>
+        <w:t>permisos ,</w:t>
+      </w:r>
+      <w:proofErr w:type="gramEnd"/>
+      <w:r>
+        <w:rPr>
+          <w:lang w:val="es-MX"/>
+        </w:rPr>
+        <w:t xml:space="preserve"> si no existe pues se procederá a crear el usuario con role normal de usuario, y  se le asociará su </w:t>
+      </w:r>
+      <w:proofErr w:type="spellStart"/>
+      <w:r>
+        <w:rPr>
+          <w:lang w:val="es-MX"/>
+        </w:rPr>
+        <w:t>usersec</w:t>
+      </w:r>
+      <w:proofErr w:type="spellEnd"/>
+      <w:r>
+        <w:rPr>
+          <w:lang w:val="es-MX"/>
+        </w:rPr>
+        <w:t xml:space="preserve"> con esos roles y permisos.</w:t>
       </w:r>
     </w:p>
     <w:p>
@@ -174,7 +410,21 @@
         <w:rPr>
           <w:lang w:val="es-MX"/>
         </w:rPr>
-        <w:t>De acuerdo al JWT cuándo se haga un posteo este estará asociado al usuario dueño del JWT através del cuál se hace la operación</w:t>
+        <w:t xml:space="preserve">De acuerdo al JWT cuándo se haga un posteo este estará asociado al usuario dueño del JWT </w:t>
+      </w:r>
+      <w:proofErr w:type="spellStart"/>
+      <w:r>
+        <w:rPr>
+          <w:lang w:val="es-MX"/>
+        </w:rPr>
+        <w:t>através</w:t>
+      </w:r>
+      <w:proofErr w:type="spellEnd"/>
+      <w:r>
+        <w:rPr>
+          <w:lang w:val="es-MX"/>
+        </w:rPr>
+        <w:t xml:space="preserve"> del cuál se hace la operación</w:t>
       </w:r>
       <w:r>
         <w:rPr>
@@ -186,7 +436,21 @@
         <w:rPr>
           <w:lang w:val="es-MX"/>
         </w:rPr>
-        <w:t xml:space="preserve">y endpoints </w:t>
+        <w:t xml:space="preserve">y </w:t>
+      </w:r>
+      <w:proofErr w:type="spellStart"/>
+      <w:r>
+        <w:rPr>
+          <w:lang w:val="es-MX"/>
+        </w:rPr>
+        <w:t>endpoints</w:t>
+      </w:r>
+      <w:proofErr w:type="spellEnd"/>
+      <w:r>
+        <w:rPr>
+          <w:lang w:val="es-MX"/>
+        </w:rPr>
+        <w:t xml:space="preserve"> </w:t>
       </w:r>
       <w:r>
         <w:rPr>
@@ -216,7 +480,21 @@
         <w:rPr>
           <w:lang w:val="es-MX"/>
         </w:rPr>
-        <w:t>Creo que ya terminamos toda  la lógica de servicio</w:t>
+        <w:t xml:space="preserve">Creo que ya terminamos </w:t>
+      </w:r>
+      <w:proofErr w:type="gramStart"/>
+      <w:r>
+        <w:rPr>
+          <w:lang w:val="es-MX"/>
+        </w:rPr>
+        <w:t>toda  la</w:t>
+      </w:r>
+      <w:proofErr w:type="gramEnd"/>
+      <w:r>
+        <w:rPr>
+          <w:lang w:val="es-MX"/>
+        </w:rPr>
+        <w:t xml:space="preserve"> lógica de servicio</w:t>
       </w:r>
     </w:p>
     <w:p>
@@ -247,7 +525,63 @@
         <w:rPr>
           <w:lang w:val="es-MX"/>
         </w:rPr>
-        <w:t>Revisar si en verdad ya terminamos toda la lógica de servicio y pasar a los test.</w:t>
+        <w:t xml:space="preserve">Tengo que poner las </w:t>
+      </w:r>
+      <w:r>
+        <w:rPr>
+          <w:b/>
+          <w:bCs/>
+          <w:lang w:val="es-MX"/>
+        </w:rPr>
+        <w:t xml:space="preserve">CREDENCIALES </w:t>
+      </w:r>
+      <w:r>
+        <w:rPr>
+          <w:lang w:val="es-MX"/>
+        </w:rPr>
+        <w:t xml:space="preserve">de OAuth2 quizás en variables de entorno o en otro </w:t>
+      </w:r>
+      <w:proofErr w:type="spellStart"/>
+      <w:r>
+        <w:rPr>
+          <w:lang w:val="es-MX"/>
+        </w:rPr>
+        <w:t>doc</w:t>
+      </w:r>
+      <w:proofErr w:type="spellEnd"/>
+      <w:r>
+        <w:rPr>
+          <w:lang w:val="es-MX"/>
+        </w:rPr>
+        <w:t xml:space="preserve"> para que </w:t>
+      </w:r>
+      <w:proofErr w:type="spellStart"/>
+      <w:r>
+        <w:rPr>
+          <w:lang w:val="es-MX"/>
+        </w:rPr>
+        <w:t>github</w:t>
+      </w:r>
+      <w:proofErr w:type="spellEnd"/>
+      <w:r>
+        <w:rPr>
+          <w:lang w:val="es-MX"/>
+        </w:rPr>
+        <w:t xml:space="preserve"> deje de tirarme el error al querer hacer el </w:t>
+      </w:r>
+      <w:proofErr w:type="spellStart"/>
+      <w:r>
+        <w:rPr>
+          <w:lang w:val="es-MX"/>
+        </w:rPr>
+        <w:t>push</w:t>
+      </w:r>
+      <w:proofErr w:type="spellEnd"/>
+      <w:r>
+        <w:rPr>
+          <w:lang w:val="es-MX"/>
+        </w:rPr>
+        <w:t>.</w:t>
       </w:r>
     </w:p>
     <w:p>
@@ -265,181 +599,41 @@
         <w:rPr>
           <w:lang w:val="es-MX"/>
         </w:rPr>
-        <w:t>En métodos que me traen los post del usuario al cuál pertenece el Token, debo hacer que se restrinja la información, que no se traiga toda la información del propietario del post, solo el nombre</w:t>
-      </w:r>
+        <w:t xml:space="preserve">Revisa OAuth2LogginSuccess, y la clase </w:t>
+      </w:r>
+      <w:proofErr w:type="spellStart"/>
+      <w:r>
+        <w:rPr>
+          <w:lang w:val="es-MX"/>
+        </w:rPr>
+        <w:t>securityConfig</w:t>
+      </w:r>
+      <w:proofErr w:type="spellEnd"/>
+      <w:r>
+        <w:rPr>
+          <w:lang w:val="es-MX"/>
+        </w:rPr>
+        <w:t xml:space="preserve"> para entender los nuevos agregados en estas clases</w:t>
+      </w:r>
+    </w:p>
+    <w:p>
+      <w:pPr>
+        <w:rPr>
+          <w:lang w:val="es-MX"/>
+        </w:rPr>
+      </w:pPr>
     </w:p>
     <w:p>
       <w:pPr>
         <w:pStyle w:val="Prrafodelista"/>
-        <w:numPr>
-          <w:ilvl w:val="0"/>
-          <w:numId w:val="4"/>
-        </w:numPr>
-        <w:rPr>
-          <w:lang w:val="es-MX"/>
-        </w:rPr>
-      </w:pPr>
-      <w:r>
-        <w:rPr>
-          <w:lang w:val="es-MX"/>
-        </w:rPr>
-        <w:t>Revisa OAuth2LogginSuccess, y la clase securityConfig para entender los nuevos agregados en estas clases</w:t>
-      </w:r>
+        <w:rPr>
+          <w:lang w:val="es-MX"/>
+        </w:rPr>
+      </w:pPr>
     </w:p>
     <w:p>
       <w:pPr>
         <w:pStyle w:val="Prrafodelista"/>
-        <w:numPr>
-          <w:ilvl w:val="0"/>
-          <w:numId w:val="4"/>
-        </w:numPr>
-        <w:rPr>
-          <w:lang w:val="es-MX"/>
-        </w:rPr>
-      </w:pPr>
-      <w:r>
-        <w:rPr>
-          <w:lang w:val="es-MX"/>
-        </w:rPr>
-        <w:t xml:space="preserve">De que manera quiero guardar los usuarios, como les asociaré su usersec, su correo, como haré para que al iniar sesión con OAuth se verifique el correo para ver si el usuario ya existe </w:t>
-      </w:r>
-      <w:r>
-        <w:rPr>
-          <w:lang w:val="es-MX"/>
-        </w:rPr>
-        <w:t xml:space="preserve">y tiene UserSec asociado </w:t>
-      </w:r>
-      <w:r>
-        <w:rPr>
-          <w:lang w:val="es-MX"/>
-        </w:rPr>
-        <w:t>y tiene roles y permisos</w:t>
-      </w:r>
-      <w:r>
-        <w:rPr>
-          <w:lang w:val="es-MX"/>
-        </w:rPr>
-        <w:t xml:space="preserve"> y así darle acceso con JWT</w:t>
-      </w:r>
-      <w:r>
-        <w:rPr>
-          <w:lang w:val="es-MX"/>
-        </w:rPr>
-        <w:t xml:space="preserve">, y sino crearlo en la base de </w:t>
-      </w:r>
-      <w:r>
-        <w:rPr>
-          <w:lang w:val="es-MX"/>
-        </w:rPr>
-        <w:t>datos como usuario normal y darle acceso al programa.</w:t>
-      </w:r>
-    </w:p>
-    <w:p>
-      <w:pPr>
-        <w:pStyle w:val="Prrafodelista"/>
-        <w:numPr>
-          <w:ilvl w:val="0"/>
-          <w:numId w:val="4"/>
-        </w:numPr>
-        <w:rPr>
-          <w:lang w:val="es-MX"/>
-        </w:rPr>
-      </w:pPr>
-      <w:r>
-        <w:rPr>
-          <w:lang w:val="es-MX"/>
-        </w:rPr>
-        <w:t>Hacer que no se pueda obtener acceso al endpoint de generación de Tokens, por seguridad</w:t>
-      </w:r>
-    </w:p>
-    <w:p>
-      <w:pPr>
-        <w:rPr>
-          <w:lang w:val="es-MX"/>
-        </w:rPr>
-      </w:pPr>
-      <w:r>
-        <w:rPr>
-          <w:lang w:val="es-MX"/>
-        </w:rPr>
-        <w:t xml:space="preserve">       . OAuh2 será la única manera de crear nuevos usuarios y a la vez autenticarse.</w:t>
-      </w:r>
-    </w:p>
-    <w:p>
-      <w:pPr>
-        <w:rPr>
-          <w:lang w:val="es-MX"/>
-        </w:rPr>
-      </w:pPr>
-    </w:p>
-    <w:p>
-      <w:pPr>
-        <w:rPr>
-          <w:lang w:val="es-MX"/>
-        </w:rPr>
-      </w:pPr>
-    </w:p>
-    <w:p>
-      <w:pPr>
-        <w:rPr>
-          <w:lang w:val="es-MX"/>
-        </w:rPr>
-      </w:pPr>
-    </w:p>
-    <w:p>
-      <w:pPr>
-        <w:pStyle w:val="Prrafodelista"/>
-        <w:numPr>
-          <w:ilvl w:val="0"/>
-          <w:numId w:val="4"/>
-        </w:numPr>
-        <w:rPr>
-          <w:lang w:val="es-MX"/>
-        </w:rPr>
-      </w:pPr>
-      <w:r>
-        <w:rPr>
-          <w:lang w:val="es-MX"/>
-        </w:rPr>
-        <w:t>Hacer que cada usuario solo pueda postear cosas que queden asociadas a su id y por lo tanto solo pueda modificar sus propios posteos.</w:t>
-      </w:r>
-    </w:p>
-    <w:p>
-      <w:pPr>
-        <w:pStyle w:val="Prrafodelista"/>
-        <w:numPr>
-          <w:ilvl w:val="0"/>
-          <w:numId w:val="4"/>
-        </w:numPr>
-        <w:rPr>
-          <w:lang w:val="es-MX"/>
-        </w:rPr>
-      </w:pPr>
-      <w:r>
-        <w:rPr>
-          <w:lang w:val="es-MX"/>
-        </w:rPr>
-        <w:lastRenderedPageBreak/>
-        <w:t xml:space="preserve">Hacer que </w:t>
-      </w:r>
-      <w:r>
-        <w:rPr>
-          <w:lang w:val="es-MX"/>
-        </w:rPr>
-        <w:t>nada se pueda eliminar completamente, solo que se pueda inhabilitar por ejemplo poniéndole un nueva columna en la entidad.</w:t>
-      </w:r>
-    </w:p>
-    <w:p>
-      <w:pPr>
-        <w:pStyle w:val="Prrafodelista"/>
-        <w:rPr>
-          <w:lang w:val="es-MX"/>
-        </w:rPr>
-      </w:pPr>
-    </w:p>
-    <w:p>
-      <w:pPr>
-        <w:pStyle w:val="Prrafodelista"/>
         <w:rPr>
           <w:lang w:val="es-MX"/>
         </w:rPr>
@@ -495,229 +689,6 @@
     </w:p>
     <w:p>
       <w:pPr>
-        <w:pStyle w:val="Prrafodelista"/>
-        <w:rPr>
-          <w:lang w:val="es-MX"/>
-        </w:rPr>
-      </w:pPr>
-    </w:p>
-    <w:p>
-      <w:pPr>
-        <w:pStyle w:val="Prrafodelista"/>
-        <w:rPr>
-          <w:lang w:val="es-MX"/>
-        </w:rPr>
-      </w:pPr>
-    </w:p>
-    <w:p>
-      <w:pPr>
-        <w:pStyle w:val="Prrafodelista"/>
-        <w:rPr>
-          <w:lang w:val="es-MX"/>
-        </w:rPr>
-      </w:pPr>
-    </w:p>
-    <w:p>
-      <w:pPr>
-        <w:pStyle w:val="Prrafodelista"/>
-        <w:rPr>
-          <w:lang w:val="es-MX"/>
-        </w:rPr>
-      </w:pPr>
-    </w:p>
-    <w:p>
-      <w:pPr>
-        <w:pStyle w:val="Prrafodelista"/>
-        <w:rPr>
-          <w:lang w:val="es-MX"/>
-        </w:rPr>
-      </w:pPr>
-    </w:p>
-    <w:p>
-      <w:pPr>
-        <w:pStyle w:val="Prrafodelista"/>
-        <w:rPr>
-          <w:b/>
-          <w:bCs/>
-          <w:lang w:val="es-MX"/>
-        </w:rPr>
-      </w:pPr>
-      <w:r>
-        <w:rPr>
-          <w:b/>
-          <w:bCs/>
-          <w:lang w:val="es-MX"/>
-        </w:rPr>
-        <w:t>Cosas Clave:</w:t>
-      </w:r>
-    </w:p>
-    <w:p>
-      <w:pPr>
-        <w:pStyle w:val="Prrafodelista"/>
-        <w:rPr>
-          <w:lang w:val="es-MX"/>
-        </w:rPr>
-      </w:pPr>
-      <w:r>
-        <w:rPr>
-          <w:b/>
-          <w:bCs/>
-          <w:lang w:val="es-MX"/>
-        </w:rPr>
-        <w:t>.</w:t>
-      </w:r>
-      <w:r>
-        <w:rPr>
-          <w:lang w:val="es-MX"/>
-        </w:rPr>
-        <w:t xml:space="preserve"> </w:t>
-      </w:r>
-    </w:p>
-    <w:p>
-      <w:pPr>
-        <w:pStyle w:val="Prrafodelista"/>
-        <w:rPr>
-          <w:lang w:val="es-MX"/>
-        </w:rPr>
-      </w:pPr>
-    </w:p>
-    <w:p>
-      <w:pPr>
-        <w:pStyle w:val="Prrafodelista"/>
-        <w:rPr>
-          <w:lang w:val="es-MX"/>
-        </w:rPr>
-      </w:pPr>
-    </w:p>
-    <w:p>
-      <w:pPr>
-        <w:pStyle w:val="Prrafodelista"/>
-        <w:rPr>
-          <w:lang w:val="es-MX"/>
-        </w:rPr>
-      </w:pPr>
-    </w:p>
-    <w:p>
-      <w:pPr>
-        <w:pStyle w:val="Prrafodelista"/>
-        <w:rPr>
-          <w:b/>
-          <w:bCs/>
-          <w:lang w:val="es-MX"/>
-        </w:rPr>
-      </w:pPr>
-      <w:r>
-        <w:rPr>
-          <w:b/>
-          <w:bCs/>
-          <w:lang w:val="es-MX"/>
-        </w:rPr>
-        <w:t>Creación de los usuarios:</w:t>
-      </w:r>
-    </w:p>
-    <w:p>
-      <w:pPr>
-        <w:pStyle w:val="Prrafodelista"/>
-        <w:rPr>
-          <w:lang w:val="es-MX"/>
-        </w:rPr>
-      </w:pPr>
-    </w:p>
-    <w:p>
-      <w:pPr>
-        <w:pStyle w:val="Prrafodelista"/>
-        <w:rPr>
-          <w:lang w:val="es-MX"/>
-        </w:rPr>
-      </w:pPr>
-      <w:r>
-        <w:rPr>
-          <w:lang w:val="es-MX"/>
-        </w:rPr>
-        <w:t>.</w:t>
-      </w:r>
-      <w:r>
-        <w:rPr>
-          <w:lang w:val="es-MX"/>
-        </w:rPr>
-        <w:t xml:space="preserve"> si desactivo un usuario usando el Delete automáticamente debo poner el campo enabled de sus posts y su UserSec</w:t>
-      </w:r>
-      <w:r>
-        <w:rPr>
-          <w:lang w:val="es-MX"/>
-        </w:rPr>
-        <w:t>(para que no funcione el User</w:t>
-      </w:r>
-      <w:r>
-        <w:rPr>
-          <w:lang w:val="es-MX"/>
-        </w:rPr>
-        <w:t>Sec</w:t>
-      </w:r>
-      <w:r>
-        <w:rPr>
-          <w:lang w:val="es-MX"/>
-        </w:rPr>
-        <w:t>)</w:t>
-      </w:r>
-      <w:r>
-        <w:rPr>
-          <w:lang w:val="es-MX"/>
-        </w:rPr>
-        <w:t xml:space="preserve"> desactivados y no se deberán mostrar tampoco.</w:t>
-      </w:r>
-    </w:p>
-    <w:p>
-      <w:pPr>
-        <w:pStyle w:val="Prrafodelista"/>
-        <w:rPr>
-          <w:lang w:val="es-MX"/>
-        </w:rPr>
-      </w:pPr>
-    </w:p>
-    <w:p>
-      <w:pPr>
-        <w:pStyle w:val="Prrafodelista"/>
-        <w:rPr>
-          <w:lang w:val="es-MX"/>
-        </w:rPr>
-      </w:pPr>
-    </w:p>
-    <w:p>
-      <w:pPr>
-        <w:pStyle w:val="Prrafodelista"/>
-        <w:rPr>
-          <w:lang w:val="es-MX"/>
-        </w:rPr>
-      </w:pPr>
-    </w:p>
-    <w:p>
-      <w:pPr>
-        <w:pStyle w:val="Prrafodelista"/>
-        <w:rPr>
-          <w:lang w:val="es-MX"/>
-        </w:rPr>
-      </w:pPr>
-    </w:p>
-    <w:p>
-      <w:pPr>
-        <w:pStyle w:val="Prrafodelista"/>
-        <w:rPr>
-          <w:lang w:val="es-MX"/>
-        </w:rPr>
-      </w:pPr>
-    </w:p>
-    <w:p>
-      <w:pPr>
-        <w:pStyle w:val="Prrafodelista"/>
-        <w:rPr>
-          <w:lang w:val="es-MX"/>
-        </w:rPr>
-      </w:pPr>
-    </w:p>
-    <w:p>
-      <w:pPr>
-        <w:pStyle w:val="Prrafodelista"/>
         <w:rPr>
           <w:lang w:val="es-MX"/>
         </w:rPr>
@@ -834,12 +805,14 @@
           <w:lang w:val="es-MX"/>
         </w:rPr>
       </w:pPr>
+      <w:proofErr w:type="spellStart"/>
       <w:r>
         <w:rPr>
           <w:lang w:val="es-MX"/>
         </w:rPr>
         <w:t>Dockerizar</w:t>
       </w:r>
+      <w:proofErr w:type="spellEnd"/>
     </w:p>
     <w:p>
       <w:pPr>

</xml_diff>

<commit_message>
Con test a medias
</commit_message>
<xml_diff>
--- a/GUIA.docx
+++ b/GUIA.docx
@@ -38,43 +38,7 @@
           <w:bCs/>
           <w:lang w:val="es-MX"/>
         </w:rPr>
-        <w:t xml:space="preserve">Ya está el </w:t>
-      </w:r>
-      <w:proofErr w:type="spellStart"/>
-      <w:r>
-        <w:rPr>
-          <w:b/>
-          <w:bCs/>
-          <w:lang w:val="es-MX"/>
-        </w:rPr>
-        <w:t>crud</w:t>
-      </w:r>
-      <w:proofErr w:type="spellEnd"/>
-      <w:r>
-        <w:rPr>
-          <w:b/>
-          <w:bCs/>
-          <w:lang w:val="es-MX"/>
-        </w:rPr>
-        <w:t xml:space="preserve"> de usuarios, roles y permisos y la </w:t>
-      </w:r>
-      <w:proofErr w:type="spellStart"/>
-      <w:r>
-        <w:rPr>
-          <w:b/>
-          <w:bCs/>
-          <w:lang w:val="es-MX"/>
-        </w:rPr>
-        <w:t>auth</w:t>
-      </w:r>
-      <w:proofErr w:type="spellEnd"/>
-      <w:r>
-        <w:rPr>
-          <w:b/>
-          <w:bCs/>
-          <w:lang w:val="es-MX"/>
-        </w:rPr>
-        <w:t xml:space="preserve"> configurada con ellos.</w:t>
+        <w:t>Ya está el crud de usuarios, roles y permisos y la auth configurada con ellos.</w:t>
       </w:r>
     </w:p>
     <w:p>
@@ -90,95 +54,37 @@
           <w:lang w:val="es-MX"/>
         </w:rPr>
       </w:pPr>
-      <w:proofErr w:type="spellStart"/>
-      <w:r>
-        <w:rPr>
-          <w:b/>
-          <w:bCs/>
-          <w:lang w:val="es-MX"/>
-        </w:rPr>
-        <w:t>Auth</w:t>
-      </w:r>
-      <w:proofErr w:type="spellEnd"/>
-      <w:r>
-        <w:rPr>
-          <w:b/>
-          <w:bCs/>
-          <w:lang w:val="es-MX"/>
-        </w:rPr>
-        <w:t xml:space="preserve"> </w:t>
-      </w:r>
-      <w:proofErr w:type="spellStart"/>
-      <w:r>
-        <w:rPr>
-          <w:b/>
-          <w:bCs/>
-          <w:lang w:val="es-MX"/>
-        </w:rPr>
-        <w:t>mediandte</w:t>
-      </w:r>
-      <w:proofErr w:type="spellEnd"/>
-      <w:r>
-        <w:rPr>
-          <w:b/>
-          <w:bCs/>
-          <w:lang w:val="es-MX"/>
-        </w:rPr>
-        <w:t xml:space="preserve"> </w:t>
-      </w:r>
-      <w:proofErr w:type="spellStart"/>
-      <w:r>
-        <w:rPr>
-          <w:b/>
-          <w:bCs/>
-          <w:lang w:val="es-MX"/>
-        </w:rPr>
-        <w:t>form</w:t>
-      </w:r>
-      <w:proofErr w:type="spellEnd"/>
-      <w:r>
-        <w:rPr>
-          <w:b/>
-          <w:bCs/>
-          <w:lang w:val="es-MX"/>
-        </w:rPr>
-        <w:t xml:space="preserve"> </w:t>
-      </w:r>
-      <w:proofErr w:type="spellStart"/>
-      <w:r>
-        <w:rPr>
-          <w:b/>
-          <w:bCs/>
-          <w:lang w:val="es-MX"/>
-        </w:rPr>
-        <w:t>login</w:t>
-      </w:r>
-      <w:proofErr w:type="spellEnd"/>
-      <w:r>
-        <w:rPr>
-          <w:b/>
-          <w:bCs/>
-          <w:lang w:val="es-MX"/>
-        </w:rPr>
-        <w:t xml:space="preserve">, </w:t>
-      </w:r>
-      <w:proofErr w:type="spellStart"/>
-      <w:r>
-        <w:rPr>
-          <w:b/>
-          <w:bCs/>
-          <w:lang w:val="es-MX"/>
-        </w:rPr>
-        <w:t>Jwt</w:t>
-      </w:r>
-      <w:proofErr w:type="spellEnd"/>
-      <w:r>
-        <w:rPr>
-          <w:b/>
-          <w:bCs/>
-          <w:lang w:val="es-MX"/>
-        </w:rPr>
-        <w:t xml:space="preserve"> y OAuth2 configurados.</w:t>
+      <w:r>
+        <w:rPr>
+          <w:b/>
+          <w:bCs/>
+          <w:lang w:val="es-MX"/>
+        </w:rPr>
+        <w:t xml:space="preserve">Auth mediandte </w:t>
+      </w:r>
+      <w:r>
+        <w:rPr>
+          <w:b/>
+          <w:bCs/>
+          <w:lang w:val="es-MX"/>
+        </w:rPr>
+        <w:t xml:space="preserve">form </w:t>
+      </w:r>
+      <w:r>
+        <w:rPr>
+          <w:b/>
+          <w:bCs/>
+          <w:lang w:val="es-MX"/>
+        </w:rPr>
+        <w:t xml:space="preserve">login, </w:t>
+      </w:r>
+      <w:r>
+        <w:rPr>
+          <w:b/>
+          <w:bCs/>
+          <w:lang w:val="es-MX"/>
+        </w:rPr>
+        <w:t>Jwt y OAuth2 configurados.</w:t>
       </w:r>
     </w:p>
     <w:p>
@@ -208,18 +114,8 @@
           <w:bCs/>
           <w:lang w:val="es-MX"/>
         </w:rPr>
-        <w:t xml:space="preserve">Al arrancar la app se inicia en la base de datos un usuario con role </w:t>
-      </w:r>
-      <w:proofErr w:type="spellStart"/>
-      <w:r>
-        <w:rPr>
-          <w:b/>
-          <w:bCs/>
-          <w:lang w:val="es-MX"/>
-        </w:rPr>
-        <w:t>Admin</w:t>
-      </w:r>
-      <w:proofErr w:type="spellEnd"/>
+        <w:t>Al arrancar la app se inicia en la base de datos un usuario con role Admin</w:t>
+      </w:r>
     </w:p>
     <w:p>
       <w:pPr>
@@ -240,97 +136,7 @@
           <w:bCs/>
           <w:lang w:val="es-MX"/>
         </w:rPr>
-        <w:t xml:space="preserve">Ya están </w:t>
-      </w:r>
-      <w:proofErr w:type="spellStart"/>
-      <w:r>
-        <w:rPr>
-          <w:b/>
-          <w:bCs/>
-          <w:lang w:val="es-MX"/>
-        </w:rPr>
-        <w:t>securizados</w:t>
-      </w:r>
-      <w:proofErr w:type="spellEnd"/>
-      <w:r>
-        <w:rPr>
-          <w:b/>
-          <w:bCs/>
-          <w:lang w:val="es-MX"/>
-        </w:rPr>
-        <w:t xml:space="preserve"> los </w:t>
-      </w:r>
-      <w:proofErr w:type="spellStart"/>
-      <w:r>
-        <w:rPr>
-          <w:b/>
-          <w:bCs/>
-          <w:lang w:val="es-MX"/>
-        </w:rPr>
-        <w:t>endpoints</w:t>
-      </w:r>
-      <w:proofErr w:type="spellEnd"/>
-      <w:r>
-        <w:rPr>
-          <w:b/>
-          <w:bCs/>
-          <w:lang w:val="es-MX"/>
-        </w:rPr>
-        <w:t xml:space="preserve"> de roles, </w:t>
-      </w:r>
-      <w:proofErr w:type="spellStart"/>
-      <w:r>
-        <w:rPr>
-          <w:b/>
-          <w:bCs/>
-          <w:lang w:val="es-MX"/>
-        </w:rPr>
-        <w:t>usersec</w:t>
-      </w:r>
-      <w:proofErr w:type="spellEnd"/>
-      <w:r>
-        <w:rPr>
-          <w:b/>
-          <w:bCs/>
-          <w:lang w:val="es-MX"/>
-        </w:rPr>
-        <w:t xml:space="preserve"> y </w:t>
-      </w:r>
-      <w:proofErr w:type="spellStart"/>
-      <w:r>
-        <w:rPr>
-          <w:b/>
-          <w:bCs/>
-          <w:lang w:val="es-MX"/>
-        </w:rPr>
-        <w:t>permission</w:t>
-      </w:r>
-      <w:proofErr w:type="spellEnd"/>
-      <w:r>
-        <w:rPr>
-          <w:b/>
-          <w:bCs/>
-          <w:lang w:val="es-MX"/>
-        </w:rPr>
-        <w:t xml:space="preserve">, solo </w:t>
-      </w:r>
-      <w:proofErr w:type="spellStart"/>
-      <w:r>
-        <w:rPr>
-          <w:b/>
-          <w:bCs/>
-          <w:lang w:val="es-MX"/>
-        </w:rPr>
-        <w:t>admins</w:t>
-      </w:r>
-      <w:proofErr w:type="spellEnd"/>
-      <w:r>
-        <w:rPr>
-          <w:b/>
-          <w:bCs/>
-          <w:lang w:val="es-MX"/>
-        </w:rPr>
-        <w:t xml:space="preserve"> pueden acceder</w:t>
+        <w:t>Ya están securizados los endpoints de roles, usersec y permission, solo admins pueden acceder</w:t>
       </w:r>
     </w:p>
     <w:p>
@@ -348,49 +154,7 @@
         <w:rPr>
           <w:lang w:val="es-MX"/>
         </w:rPr>
-        <w:t xml:space="preserve">Se usará OAuth para ingresar al sistema, una vez dentro se debe verificar mediante el correo si es que ya hay un usuario registrado con este mismo, si </w:t>
-      </w:r>
-      <w:proofErr w:type="spellStart"/>
-      <w:r>
-        <w:rPr>
-          <w:lang w:val="es-MX"/>
-        </w:rPr>
-        <w:t>si</w:t>
-      </w:r>
-      <w:proofErr w:type="spellEnd"/>
-      <w:r>
-        <w:rPr>
-          <w:lang w:val="es-MX"/>
-        </w:rPr>
-        <w:t xml:space="preserve"> se libera un token con sus roles y </w:t>
-      </w:r>
-      <w:proofErr w:type="gramStart"/>
-      <w:r>
-        <w:rPr>
-          <w:lang w:val="es-MX"/>
-        </w:rPr>
-        <w:t>permisos ,</w:t>
-      </w:r>
-      <w:proofErr w:type="gramEnd"/>
-      <w:r>
-        <w:rPr>
-          <w:lang w:val="es-MX"/>
-        </w:rPr>
-        <w:t xml:space="preserve"> si no existe pues se procederá a crear el usuario con role normal de usuario, y  se le asociará su </w:t>
-      </w:r>
-      <w:proofErr w:type="spellStart"/>
-      <w:r>
-        <w:rPr>
-          <w:lang w:val="es-MX"/>
-        </w:rPr>
-        <w:t>usersec</w:t>
-      </w:r>
-      <w:proofErr w:type="spellEnd"/>
-      <w:r>
-        <w:rPr>
-          <w:lang w:val="es-MX"/>
-        </w:rPr>
-        <w:t xml:space="preserve"> con esos roles y permisos.</w:t>
+        <w:t>Se usará OAuth para ingresar al sistema, una vez dentro se debe verificar mediante el correo si es que ya hay un usuario registrado con este mismo, si si se libera un token con sus roles y permisos , si no existe pues se procederá a crear el usuario con role normal de usuario, y  se le asociará su usersec con esos roles y permisos.</w:t>
       </w:r>
     </w:p>
     <w:p>
@@ -410,21 +174,7 @@
         <w:rPr>
           <w:lang w:val="es-MX"/>
         </w:rPr>
-        <w:t xml:space="preserve">De acuerdo al JWT cuándo se haga un posteo este estará asociado al usuario dueño del JWT </w:t>
-      </w:r>
-      <w:proofErr w:type="spellStart"/>
-      <w:r>
-        <w:rPr>
-          <w:lang w:val="es-MX"/>
-        </w:rPr>
-        <w:t>através</w:t>
-      </w:r>
-      <w:proofErr w:type="spellEnd"/>
-      <w:r>
-        <w:rPr>
-          <w:lang w:val="es-MX"/>
-        </w:rPr>
-        <w:t xml:space="preserve"> del cuál se hace la operación</w:t>
+        <w:t>De acuerdo al JWT cuándo se haga un posteo este estará asociado al usuario dueño del JWT através del cuál se hace la operación</w:t>
       </w:r>
       <w:r>
         <w:rPr>
@@ -436,21 +186,7 @@
         <w:rPr>
           <w:lang w:val="es-MX"/>
         </w:rPr>
-        <w:t xml:space="preserve">y </w:t>
-      </w:r>
-      <w:proofErr w:type="spellStart"/>
-      <w:r>
-        <w:rPr>
-          <w:lang w:val="es-MX"/>
-        </w:rPr>
-        <w:t>endpoints</w:t>
-      </w:r>
-      <w:proofErr w:type="spellEnd"/>
-      <w:r>
-        <w:rPr>
-          <w:lang w:val="es-MX"/>
-        </w:rPr>
-        <w:t xml:space="preserve"> </w:t>
+        <w:t xml:space="preserve">y endpoints </w:t>
       </w:r>
       <w:r>
         <w:rPr>
@@ -480,21 +216,7 @@
         <w:rPr>
           <w:lang w:val="es-MX"/>
         </w:rPr>
-        <w:t xml:space="preserve">Creo que ya terminamos </w:t>
-      </w:r>
-      <w:proofErr w:type="gramStart"/>
-      <w:r>
-        <w:rPr>
-          <w:lang w:val="es-MX"/>
-        </w:rPr>
-        <w:t>toda  la</w:t>
-      </w:r>
-      <w:proofErr w:type="gramEnd"/>
-      <w:r>
-        <w:rPr>
-          <w:lang w:val="es-MX"/>
-        </w:rPr>
-        <w:t xml:space="preserve"> lógica de servicio</w:t>
+        <w:t>Creo que ya terminamos toda  la lógica de servicio</w:t>
       </w:r>
     </w:p>
     <w:p>
@@ -539,49 +261,7 @@
         <w:rPr>
           <w:lang w:val="es-MX"/>
         </w:rPr>
-        <w:t xml:space="preserve">de OAuth2 quizás en variables de entorno o en otro </w:t>
-      </w:r>
-      <w:proofErr w:type="spellStart"/>
-      <w:r>
-        <w:rPr>
-          <w:lang w:val="es-MX"/>
-        </w:rPr>
-        <w:t>doc</w:t>
-      </w:r>
-      <w:proofErr w:type="spellEnd"/>
-      <w:r>
-        <w:rPr>
-          <w:lang w:val="es-MX"/>
-        </w:rPr>
-        <w:t xml:space="preserve"> para que </w:t>
-      </w:r>
-      <w:proofErr w:type="spellStart"/>
-      <w:r>
-        <w:rPr>
-          <w:lang w:val="es-MX"/>
-        </w:rPr>
-        <w:t>github</w:t>
-      </w:r>
-      <w:proofErr w:type="spellEnd"/>
-      <w:r>
-        <w:rPr>
-          <w:lang w:val="es-MX"/>
-        </w:rPr>
-        <w:t xml:space="preserve"> deje de tirarme el error al querer hacer el </w:t>
-      </w:r>
-      <w:proofErr w:type="spellStart"/>
-      <w:r>
-        <w:rPr>
-          <w:lang w:val="es-MX"/>
-        </w:rPr>
-        <w:t>push</w:t>
-      </w:r>
-      <w:proofErr w:type="spellEnd"/>
-      <w:r>
-        <w:rPr>
-          <w:lang w:val="es-MX"/>
-        </w:rPr>
-        <w:t>.</w:t>
+        <w:t>de OAuth2 quizás en variables de entorno o en otro doc para que github deje de tirarme el error al querer hacer el push.</w:t>
       </w:r>
     </w:p>
     <w:p>
@@ -599,91 +279,186 @@
         <w:rPr>
           <w:lang w:val="es-MX"/>
         </w:rPr>
-        <w:t xml:space="preserve">Revisa OAuth2LogginSuccess, y la clase </w:t>
-      </w:r>
-      <w:proofErr w:type="spellStart"/>
-      <w:r>
-        <w:rPr>
-          <w:lang w:val="es-MX"/>
-        </w:rPr>
-        <w:t>securityConfig</w:t>
-      </w:r>
-      <w:proofErr w:type="spellEnd"/>
-      <w:r>
-        <w:rPr>
-          <w:lang w:val="es-MX"/>
-        </w:rPr>
-        <w:t xml:space="preserve"> para entender los nuevos agregados en estas clases</w:t>
-      </w:r>
-    </w:p>
-    <w:p>
-      <w:pPr>
-        <w:rPr>
-          <w:lang w:val="es-MX"/>
-        </w:rPr>
-      </w:pPr>
-    </w:p>
-    <w:p>
-      <w:pPr>
-        <w:pStyle w:val="Prrafodelista"/>
-        <w:rPr>
-          <w:lang w:val="es-MX"/>
-        </w:rPr>
-      </w:pPr>
-    </w:p>
-    <w:p>
-      <w:pPr>
-        <w:pStyle w:val="Prrafodelista"/>
-        <w:rPr>
-          <w:lang w:val="es-MX"/>
-        </w:rPr>
-      </w:pPr>
-    </w:p>
-    <w:p>
-      <w:pPr>
-        <w:rPr>
-          <w:lang w:val="es-MX"/>
-        </w:rPr>
-      </w:pPr>
-    </w:p>
-    <w:p>
-      <w:pPr>
-        <w:rPr>
-          <w:lang w:val="es-MX"/>
-        </w:rPr>
-      </w:pPr>
-    </w:p>
-    <w:p>
-      <w:pPr>
-        <w:rPr>
-          <w:lang w:val="es-MX"/>
-        </w:rPr>
-      </w:pPr>
-    </w:p>
-    <w:p>
-      <w:pPr>
-        <w:rPr>
-          <w:lang w:val="es-MX"/>
-        </w:rPr>
-      </w:pPr>
-    </w:p>
-    <w:p>
-      <w:pPr>
-        <w:rPr>
-          <w:lang w:val="es-MX"/>
-        </w:rPr>
-      </w:pPr>
-    </w:p>
-    <w:p>
-      <w:pPr>
-        <w:rPr>
-          <w:lang w:val="es-MX"/>
-        </w:rPr>
-      </w:pPr>
-      <w:r>
-        <w:rPr>
-          <w:lang w:val="es-MX"/>
-        </w:rPr>
+        <w:t>Revisa OAuth2LogginSuccess, y la clase securityConfig para entender los nuevos agregados en estas clases</w:t>
+      </w:r>
+    </w:p>
+    <w:p>
+      <w:pPr>
+        <w:rPr>
+          <w:lang w:val="es-MX"/>
+        </w:rPr>
+      </w:pPr>
+    </w:p>
+    <w:p>
+      <w:pPr>
+        <w:pStyle w:val="Prrafodelista"/>
+        <w:rPr>
+          <w:b/>
+          <w:bCs/>
+          <w:lang w:val="es-MX"/>
+        </w:rPr>
+      </w:pPr>
+      <w:r>
+        <w:rPr>
+          <w:b/>
+          <w:bCs/>
+          <w:lang w:val="es-MX"/>
+        </w:rPr>
+        <w:t>Tests:</w:t>
+      </w:r>
+    </w:p>
+    <w:p>
+      <w:pPr>
+        <w:pStyle w:val="Prrafodelista"/>
+        <w:rPr>
+          <w:b/>
+          <w:bCs/>
+          <w:lang w:val="es-MX"/>
+        </w:rPr>
+      </w:pPr>
+    </w:p>
+    <w:p>
+      <w:pPr>
+        <w:pStyle w:val="Prrafodelista"/>
+        <w:rPr>
+          <w:b/>
+          <w:bCs/>
+          <w:lang w:val="es-MX"/>
+        </w:rPr>
+      </w:pPr>
+      <w:r>
+        <w:rPr>
+          <w:b/>
+          <w:bCs/>
+          <w:lang w:val="es-MX"/>
+        </w:rPr>
+        <w:t>Cosas y clases a testear:</w:t>
+      </w:r>
+    </w:p>
+    <w:p>
+      <w:pPr>
+        <w:pStyle w:val="Prrafodelista"/>
+        <w:rPr>
+          <w:b/>
+          <w:bCs/>
+          <w:lang w:val="es-MX"/>
+        </w:rPr>
+      </w:pPr>
+    </w:p>
+    <w:p>
+      <w:pPr>
+        <w:pStyle w:val="Prrafodelista"/>
+        <w:numPr>
+          <w:ilvl w:val="0"/>
+          <w:numId w:val="4"/>
+        </w:numPr>
+        <w:rPr>
+          <w:b/>
+          <w:bCs/>
+          <w:lang w:val="es-MX"/>
+        </w:rPr>
+      </w:pPr>
+      <w:r>
+        <w:rPr>
+          <w:lang w:val="es-MX"/>
+        </w:rPr>
+        <w:t>Controladores, test unitarios y de integración</w:t>
+      </w:r>
+    </w:p>
+    <w:p>
+      <w:pPr>
+        <w:pStyle w:val="Prrafodelista"/>
+        <w:numPr>
+          <w:ilvl w:val="0"/>
+          <w:numId w:val="4"/>
+        </w:numPr>
+        <w:rPr>
+          <w:b/>
+          <w:bCs/>
+          <w:lang w:val="es-MX"/>
+        </w:rPr>
+      </w:pPr>
+      <w:r>
+        <w:rPr>
+          <w:lang w:val="es-MX"/>
+        </w:rPr>
+        <w:t>El UserDetailsService</w:t>
+      </w:r>
+    </w:p>
+    <w:p>
+      <w:pPr>
+        <w:pStyle w:val="Prrafodelista"/>
+        <w:numPr>
+          <w:ilvl w:val="0"/>
+          <w:numId w:val="4"/>
+        </w:numPr>
+        <w:rPr>
+          <w:b/>
+          <w:bCs/>
+          <w:lang w:val="es-MX"/>
+        </w:rPr>
+      </w:pPr>
+      <w:r>
+        <w:rPr>
+          <w:lang w:val="es-MX"/>
+        </w:rPr>
+        <w:t>La capa de seguridad</w:t>
+      </w:r>
+    </w:p>
+    <w:p>
+      <w:pPr>
+        <w:pStyle w:val="Prrafodelista"/>
+        <w:rPr>
+          <w:lang w:val="es-MX"/>
+        </w:rPr>
+      </w:pPr>
+    </w:p>
+    <w:p>
+      <w:pPr>
+        <w:rPr>
+          <w:lang w:val="es-MX"/>
+        </w:rPr>
+      </w:pPr>
+    </w:p>
+    <w:p>
+      <w:pPr>
+        <w:rPr>
+          <w:lang w:val="es-MX"/>
+        </w:rPr>
+      </w:pPr>
+    </w:p>
+    <w:p>
+      <w:pPr>
+        <w:rPr>
+          <w:lang w:val="es-MX"/>
+        </w:rPr>
+      </w:pPr>
+    </w:p>
+    <w:p>
+      <w:pPr>
+        <w:rPr>
+          <w:lang w:val="es-MX"/>
+        </w:rPr>
+      </w:pPr>
+    </w:p>
+    <w:p>
+      <w:pPr>
+        <w:rPr>
+          <w:lang w:val="es-MX"/>
+        </w:rPr>
+      </w:pPr>
+    </w:p>
+    <w:p>
+      <w:pPr>
+        <w:rPr>
+          <w:lang w:val="es-MX"/>
+        </w:rPr>
+      </w:pPr>
+      <w:r>
+        <w:rPr>
+          <w:lang w:val="es-MX"/>
+        </w:rPr>
+        <w:lastRenderedPageBreak/>
         <w:t>Pendientes:</w:t>
       </w:r>
     </w:p>
@@ -805,14 +580,12 @@
           <w:lang w:val="es-MX"/>
         </w:rPr>
       </w:pPr>
-      <w:proofErr w:type="spellStart"/>
       <w:r>
         <w:rPr>
           <w:lang w:val="es-MX"/>
         </w:rPr>
         <w:t>Dockerizar</w:t>
       </w:r>
-      <w:proofErr w:type="spellEnd"/>
     </w:p>
     <w:p>
       <w:pPr>

</xml_diff>